<commit_message>
feat(design): complete primary equipment and CAD deliverables
Add MOA, ZCT, grounding packages, bus and insulation checks with explicit engineering boundaries.

Regenerate four A1 drawings, formal reports and defense deck; strengthen reproducibility, metadata and public-release validation.
</commit_message>
<xml_diff>
--- a/report/03_220kV新能源汇集变电所_课程设计总结.docx
+++ b/report/03_220kV新能源汇集变电所_课程设计总结.docx
@@ -13,7 +13,7 @@
           <w:noProof/>
         </w:rPr>
         <w:drawing>
-          <wp:inline distT="0" distB="0" distL="0" distR="0" wp14:anchorId="6C4B83CF" wp14:editId="280C8B65">
+          <wp:inline distT="0" distB="0" distL="0" distR="0" wp14:anchorId="26E29E3F" wp14:editId="5EDD9ED1">
             <wp:extent cx="936000" cy="873600"/>
             <wp:effectExtent l="0" t="0" r="0" b="0"/>
             <wp:docPr id="1" name="Picture 1" descr="学校校徽" title="学校校徽"/>
@@ -60,7 +60,7 @@
           <w:noProof/>
         </w:rPr>
         <w:drawing>
-          <wp:inline distT="0" distB="0" distL="0" distR="0" wp14:anchorId="044C6A73" wp14:editId="029C7F92">
+          <wp:inline distT="0" distB="0" distL="0" distR="0" wp14:anchorId="7722A026" wp14:editId="0666C50C">
             <wp:extent cx="3060000" cy="715172"/>
             <wp:effectExtent l="0" t="0" r="0" b="0"/>
             <wp:docPr id="2" name="Picture 2" descr="学校名称书法标识" title="学校名称书法标识"/>
@@ -887,6 +887,7 @@
     </w:p>
     <w:p>
       <w:pPr>
+        <w:snapToGrid w:val="0"/>
         <w:spacing w:line="20" w:lineRule="exact"/>
         <w:ind w:firstLine="480"/>
         <w:sectPr>
@@ -948,7 +949,7 @@
           <w:rFonts w:cs="Times New Roman"/>
           <w:color w:val="000000"/>
         </w:rPr>
-        <w:t>新能源汇集变电所电气一次部分展开，任务包括主接线、主变和所用变选择、负荷与持续电流计算、短路计算、主要设备校验、配电装置布置以及三张电气图纸。设计过程从任务书原始数据出发，先冻结运行方式和计算口径，再把同一组基线同步到计算、设备表和</w:t>
+        <w:t>新能源汇集变电所电气一次部分展开，任务包括主接线、主变和所用变选择、负荷与持续电流计算、短路计算、主要设备校验、配电装置布置以及三张必交图加一张增强详图。设计过程从任务书原始数据出发，先冻结运行方式和计算口径，再把同一组基线同步到计算、设备表和</w:t>
       </w:r>
       <w:r>
         <w:rPr>
@@ -1338,63 +1339,162 @@
           <w:color w:val="000000"/>
           <w:sz w:val="23"/>
         </w:rPr>
-        <w:t>完成</w:t>
-      </w:r>
-      <w:r>
-        <w:rPr>
-          <w:rFonts w:cs="Times New Roman"/>
-          <w:color w:val="000000"/>
-          <w:sz w:val="23"/>
-        </w:rPr>
-        <w:t>220kV</w:t>
-      </w:r>
-      <w:r>
-        <w:rPr>
-          <w:rFonts w:cs="Times New Roman"/>
-          <w:color w:val="000000"/>
-          <w:sz w:val="23"/>
-        </w:rPr>
-        <w:t>主接线、户外</w:t>
-      </w:r>
-      <w:r>
-        <w:rPr>
-          <w:rFonts w:cs="Times New Roman"/>
-          <w:color w:val="000000"/>
-          <w:sz w:val="23"/>
-        </w:rPr>
-        <w:t>AIS</w:t>
-      </w:r>
-      <w:r>
-        <w:rPr>
-          <w:rFonts w:cs="Times New Roman"/>
-          <w:color w:val="000000"/>
-          <w:sz w:val="23"/>
-        </w:rPr>
-        <w:t>平面和典型断面的</w:t>
-      </w:r>
-      <w:r>
-        <w:rPr>
-          <w:rFonts w:cs="Times New Roman"/>
-          <w:color w:val="000000"/>
-          <w:sz w:val="23"/>
-        </w:rPr>
-        <w:t>DWG/DXF/PDF/PNG</w:t>
-      </w:r>
-      <w:r>
-        <w:rPr>
-          <w:rFonts w:cs="Times New Roman"/>
-          <w:color w:val="000000"/>
-          <w:sz w:val="23"/>
-        </w:rPr>
-        <w:t>底图。</w:t>
+        <w:t>补齐</w:t>
+      </w:r>
+      <w:r>
+        <w:rPr>
+          <w:rFonts w:cs="Times New Roman"/>
+          <w:color w:val="000000"/>
+          <w:sz w:val="23"/>
+        </w:rPr>
+        <w:t>MOA</w:t>
+      </w:r>
+      <w:r>
+        <w:rPr>
+          <w:rFonts w:cs="Times New Roman"/>
+          <w:color w:val="000000"/>
+          <w:sz w:val="23"/>
+        </w:rPr>
+        <w:t>、零序</w:t>
+      </w:r>
+      <w:r>
+        <w:rPr>
+          <w:rFonts w:cs="Times New Roman"/>
+          <w:color w:val="000000"/>
+          <w:sz w:val="23"/>
+        </w:rPr>
+        <w:t>CT</w:t>
+      </w:r>
+      <w:r>
+        <w:rPr>
+          <w:rFonts w:cs="Times New Roman"/>
+          <w:color w:val="000000"/>
+          <w:sz w:val="23"/>
+        </w:rPr>
+        <w:t>、接地开关和</w:t>
+      </w:r>
+      <w:r>
+        <w:rPr>
+          <w:rFonts w:cs="Times New Roman"/>
+          <w:color w:val="000000"/>
+          <w:sz w:val="23"/>
+        </w:rPr>
+        <w:t>35/10kV</w:t>
+      </w:r>
+      <w:r>
+        <w:rPr>
+          <w:rFonts w:cs="Times New Roman"/>
+          <w:color w:val="000000"/>
+          <w:sz w:val="23"/>
+        </w:rPr>
+        <w:t>接地设备包，并固化母联转供时仅保留健康侧</w:t>
+      </w:r>
+      <w:r>
+        <w:rPr>
+          <w:rFonts w:cs="Times New Roman"/>
+          <w:color w:val="000000"/>
+          <w:sz w:val="23"/>
+        </w:rPr>
+        <w:t>1</w:t>
+      </w:r>
+      <w:r>
+        <w:rPr>
+          <w:rFonts w:cs="Times New Roman"/>
+          <w:color w:val="000000"/>
+          <w:sz w:val="23"/>
+        </w:rPr>
+        <w:t>套接地源的联锁。</w:t>
       </w:r>
     </w:p>
     <w:p>
       <w:pPr>
+        <w:pStyle w:val="aa"/>
+        <w:numPr>
+          <w:ilvl w:val="0"/>
+          <w:numId w:val="1"/>
+        </w:numPr>
+        <w:ind w:left="420" w:firstLine="460"/>
+      </w:pPr>
+      <w:r>
+        <w:rPr>
+          <w:rFonts w:cs="Times New Roman"/>
+          <w:color w:val="000000"/>
+          <w:sz w:val="23"/>
+        </w:rPr>
+        <w:t>完成</w:t>
+      </w:r>
+      <w:r>
+        <w:rPr>
+          <w:rFonts w:cs="Times New Roman"/>
+          <w:color w:val="000000"/>
+          <w:sz w:val="23"/>
+        </w:rPr>
+        <w:t>220kV</w:t>
+      </w:r>
+      <w:r>
+        <w:rPr>
+          <w:rFonts w:cs="Times New Roman"/>
+          <w:color w:val="000000"/>
+          <w:sz w:val="23"/>
+        </w:rPr>
+        <w:t>主接线、户外</w:t>
+      </w:r>
+      <w:r>
+        <w:rPr>
+          <w:rFonts w:cs="Times New Roman"/>
+          <w:color w:val="000000"/>
+          <w:sz w:val="23"/>
+        </w:rPr>
+        <w:t>AIS</w:t>
+      </w:r>
+      <w:r>
+        <w:rPr>
+          <w:rFonts w:cs="Times New Roman"/>
+          <w:color w:val="000000"/>
+          <w:sz w:val="23"/>
+        </w:rPr>
+        <w:t>平面、典型断面和</w:t>
+      </w:r>
+      <w:r>
+        <w:rPr>
+          <w:rFonts w:cs="Times New Roman"/>
+          <w:color w:val="000000"/>
+          <w:sz w:val="23"/>
+        </w:rPr>
+        <w:t>L1</w:t>
+      </w:r>
+      <w:r>
+        <w:rPr>
+          <w:rFonts w:cs="Times New Roman"/>
+          <w:color w:val="000000"/>
+          <w:sz w:val="23"/>
+        </w:rPr>
+        <w:t>线路间隔增强详图的</w:t>
+      </w:r>
+      <w:r>
+        <w:rPr>
+          <w:rFonts w:cs="Times New Roman"/>
+          <w:color w:val="000000"/>
+          <w:sz w:val="23"/>
+        </w:rPr>
+        <w:t>DWG/DXF/PDF/PNG</w:t>
+      </w:r>
+      <w:r>
+        <w:rPr>
+          <w:rFonts w:cs="Times New Roman"/>
+          <w:color w:val="000000"/>
+          <w:sz w:val="23"/>
+        </w:rPr>
+        <w:t>底图。</w:t>
+      </w:r>
+    </w:p>
+    <w:p>
+      <w:pPr>
         <w:pStyle w:val="2"/>
         <w:ind w:right="240"/>
       </w:pPr>
       <w:r>
+        <w:lastRenderedPageBreak/>
         <w:t xml:space="preserve">3 </w:t>
       </w:r>
       <w:r>
@@ -1403,6 +1503,7 @@
     </w:p>
     <w:p>
       <w:pPr>
+        <w:keepLines/>
         <w:ind w:firstLine="480"/>
       </w:pPr>
       <w:r>
@@ -1410,15 +1511,7 @@
           <w:rFonts w:cs="Times New Roman"/>
           <w:color w:val="000000"/>
         </w:rPr>
-        <w:t>课程设计中最重要的不是孤立得到一个数值，而是保持任务书、运行方式、计算</w:t>
-      </w:r>
-      <w:r>
-        <w:rPr>
-          <w:rFonts w:cs="Times New Roman"/>
-          <w:color w:val="000000"/>
-        </w:rPr>
-        <w:lastRenderedPageBreak/>
-        <w:t>点、设备职责和图纸表达一致。例如，</w:t>
+        <w:t>课程设计中最重要的不是孤立得到一个数值，而是保持任务书、运行方式、计算点、设备职责和图纸表达一致。例如，</w:t>
       </w:r>
       <w:r>
         <w:rPr>
@@ -1446,7 +1539,7 @@
           <w:rFonts w:cs="Times New Roman"/>
           <w:color w:val="000000"/>
         </w:rPr>
-        <w:t>母联的正常状态直接决定短路等值；主变</w:t>
+        <w:t>母联的正常状态直接决定短路等值；母联合闸前还必须退出受电段接地源，避免两套低电阻并联改变接地故障电流；主变</w:t>
       </w:r>
       <w:r>
         <w:rPr>
@@ -1577,6 +1670,7 @@
     </w:p>
     <w:p>
       <w:pPr>
+        <w:keepLines/>
         <w:ind w:firstLine="480"/>
       </w:pPr>
       <w:r>
@@ -1619,14 +1713,28 @@
           <w:rFonts w:cs="Times New Roman"/>
           <w:color w:val="000000"/>
         </w:rPr>
-        <w:t>CT/PT</w:t>
-      </w:r>
-      <w:r>
-        <w:rPr>
-          <w:rFonts w:cs="Times New Roman"/>
-          <w:color w:val="000000"/>
-        </w:rPr>
-        <w:t>二次参数、接地网、避雷器和厂家</w:t>
+        <w:t>CT/PT/ZCT</w:t>
+      </w:r>
+      <w:r>
+        <w:rPr>
+          <w:rFonts w:cs="Times New Roman"/>
+          <w:color w:val="000000"/>
+        </w:rPr>
+        <w:t>二次参数、</w:t>
+      </w:r>
+      <w:r>
+        <w:rPr>
+          <w:rFonts w:cs="Times New Roman"/>
+          <w:color w:val="000000"/>
+        </w:rPr>
+        <w:t>35/10kV</w:t>
+      </w:r>
+      <w:r>
+        <w:rPr>
+          <w:rFonts w:cs="Times New Roman"/>
+          <w:color w:val="000000"/>
+        </w:rPr>
+        <w:t>母线机械、接地网、避雷器和厂家</w:t>
       </w:r>
       <w:r>
         <w:rPr>
@@ -1829,7 +1937,7 @@
                 <w:color w:val="000000"/>
                 <w:sz w:val="19"/>
               </w:rPr>
-              <w:t>47</w:t>
+              <w:t>当前</w:t>
             </w:r>
             <w:r>
               <w:rPr>
@@ -1837,7 +1945,31 @@
                 <w:color w:val="000000"/>
                 <w:sz w:val="19"/>
               </w:rPr>
-              <w:t>项通过</w:t>
+              <w:t>CAD/</w:t>
+            </w:r>
+            <w:r>
+              <w:rPr>
+                <w:rFonts w:cs="Times New Roman"/>
+                <w:color w:val="000000"/>
+                <w:sz w:val="19"/>
+              </w:rPr>
+              <w:t>设备源阶段</w:t>
+            </w:r>
+            <w:r>
+              <w:rPr>
+                <w:rFonts w:cs="Times New Roman"/>
+                <w:color w:val="000000"/>
+                <w:sz w:val="19"/>
+              </w:rPr>
+              <w:t>62</w:t>
+            </w:r>
+            <w:r>
+              <w:rPr>
+                <w:rFonts w:cs="Times New Roman"/>
+                <w:color w:val="000000"/>
+                <w:sz w:val="19"/>
+              </w:rPr>
+              <w:t>项通过；正式再生成后以最新全量结果为准</w:t>
             </w:r>
           </w:p>
         </w:tc>
@@ -1897,7 +2029,7 @@
                 <w:color w:val="000000"/>
                 <w:sz w:val="19"/>
               </w:rPr>
-              <w:t>53</w:t>
+              <w:t>当前</w:t>
             </w:r>
             <w:r>
               <w:rPr>
@@ -1905,7 +2037,15 @@
                 <w:color w:val="000000"/>
                 <w:sz w:val="19"/>
               </w:rPr>
-              <w:t>条路径检查通过</w:t>
+              <w:t>68</w:t>
+            </w:r>
+            <w:r>
+              <w:rPr>
+                <w:rFonts w:cs="Times New Roman"/>
+                <w:color w:val="000000"/>
+                <w:sz w:val="19"/>
+              </w:rPr>
+              <w:t>条检查通过；正式再生成后重新执行</w:t>
             </w:r>
           </w:p>
         </w:tc>
@@ -1965,7 +2105,7 @@
                 <w:color w:val="000000"/>
                 <w:sz w:val="19"/>
               </w:rPr>
-              <w:t>三图回路、编号、净距和几何基线一致</w:t>
+              <w:t>四图回路、设备链、编号、净距和几何基线一致</w:t>
             </w:r>
           </w:p>
         </w:tc>
@@ -2094,6 +2234,7 @@
     <w:p>
       <w:pPr>
         <w:pStyle w:val="2"/>
+        <w:pageBreakBefore/>
         <w:ind w:right="240"/>
       </w:pPr>
       <w:r>
@@ -2106,6 +2247,7 @@
     <w:p>
       <w:pPr>
         <w:pStyle w:val="aa"/>
+        <w:keepLines/>
         <w:numPr>
           <w:ilvl w:val="0"/>
           <w:numId w:val="1"/>
@@ -2124,6 +2266,7 @@
     <w:p>
       <w:pPr>
         <w:pStyle w:val="aa"/>
+        <w:keepLines/>
         <w:numPr>
           <w:ilvl w:val="0"/>
           <w:numId w:val="1"/>
@@ -2158,6 +2301,7 @@
     <w:p>
       <w:pPr>
         <w:pStyle w:val="aa"/>
+        <w:keepLines/>
         <w:numPr>
           <w:ilvl w:val="0"/>
           <w:numId w:val="1"/>
@@ -2208,6 +2352,7 @@
     <w:p>
       <w:pPr>
         <w:pStyle w:val="aa"/>
+        <w:keepLines/>
         <w:numPr>
           <w:ilvl w:val="0"/>
           <w:numId w:val="1"/>
@@ -2228,20 +2373,69 @@
           <w:color w:val="000000"/>
           <w:sz w:val="23"/>
         </w:rPr>
-        <w:t>CT/PT</w:t>
-      </w:r>
-      <w:r>
-        <w:rPr>
-          <w:rFonts w:cs="Times New Roman"/>
-          <w:color w:val="000000"/>
-          <w:sz w:val="23"/>
-        </w:rPr>
-        <w:t>二次负荷、避雷器绝缘配合、接地网、母线机械与电晕等专项。</w:t>
+        <w:t>CT/PT/ZCT</w:t>
+      </w:r>
+      <w:r>
+        <w:rPr>
+          <w:rFonts w:cs="Times New Roman"/>
+          <w:color w:val="000000"/>
+          <w:sz w:val="23"/>
+        </w:rPr>
+        <w:t>负担、避雷器</w:t>
+      </w:r>
+      <w:r>
+        <w:rPr>
+          <w:rFonts w:cs="Times New Roman"/>
+          <w:color w:val="000000"/>
+          <w:sz w:val="23"/>
+        </w:rPr>
+        <w:t>TOV/</w:t>
+      </w:r>
+      <w:r>
+        <w:rPr>
+          <w:rFonts w:cs="Times New Roman"/>
+          <w:color w:val="000000"/>
+          <w:sz w:val="23"/>
+        </w:rPr>
+        <w:t>能量、接地网与接地源联锁、</w:t>
+      </w:r>
+      <w:r>
+        <w:rPr>
+          <w:rFonts w:cs="Times New Roman"/>
+          <w:color w:val="000000"/>
+          <w:sz w:val="23"/>
+        </w:rPr>
+        <w:t>35/10kV</w:t>
+      </w:r>
+      <w:r>
+        <w:rPr>
+          <w:rFonts w:cs="Times New Roman"/>
+          <w:color w:val="000000"/>
+          <w:sz w:val="23"/>
+        </w:rPr>
+        <w:t>母线机械及套管爬距</w:t>
+      </w:r>
+      <w:r>
+        <w:rPr>
+          <w:rFonts w:cs="Times New Roman"/>
+          <w:color w:val="000000"/>
+          <w:sz w:val="23"/>
+        </w:rPr>
+        <w:t>/</w:t>
+      </w:r>
+      <w:r>
+        <w:rPr>
+          <w:rFonts w:cs="Times New Roman"/>
+          <w:color w:val="000000"/>
+          <w:sz w:val="23"/>
+        </w:rPr>
+        <w:t>机械等专项。</w:t>
       </w:r>
     </w:p>
     <w:p>
       <w:pPr>
         <w:pStyle w:val="aa"/>
+        <w:keepLines/>
         <w:numPr>
           <w:ilvl w:val="0"/>
           <w:numId w:val="1"/>
@@ -2440,7 +2634,7 @@
         <w:color w:val="000000"/>
         <w:sz w:val="18"/>
       </w:rPr>
-      <w:t>15</w:t>
+      <w:t>16</w:t>
     </w:r>
     <w:r>
       <w:rPr>
@@ -2651,23 +2845,6 @@
     </w:lvl>
   </w:abstractNum>
   <w:abstractNum w:abstractNumId="1" w15:restartNumberingAfterBreak="0">
-    <w:nsid w:val="07A73E9F"/>
-    <w:multiLevelType w:val="singleLevel"/>
-    <w:tmpl w:val="2E70C462"/>
-    <w:lvl w:ilvl="0">
-      <w:start w:val="1"/>
-      <w:numFmt w:val="bullet"/>
-      <w:lvlText w:val="•"/>
-      <w:lvlJc w:val="left"/>
-      <w:pPr>
-        <w:tabs>
-          <w:tab w:val="num" w:pos="420"/>
-        </w:tabs>
-        <w:ind w:left="720" w:hanging="300"/>
-      </w:pPr>
-    </w:lvl>
-  </w:abstractNum>
-  <w:abstractNum w:abstractNumId="2" w15:restartNumberingAfterBreak="0">
     <w:nsid w:val="0CCF0B4E"/>
     <w:multiLevelType w:val="hybridMultilevel"/>
     <w:tmpl w:val="F5EA9E1C"/>
@@ -2756,7 +2933,7 @@
       </w:pPr>
     </w:lvl>
   </w:abstractNum>
-  <w:abstractNum w:abstractNumId="3" w15:restartNumberingAfterBreak="0">
+  <w:abstractNum w:abstractNumId="2" w15:restartNumberingAfterBreak="0">
     <w:nsid w:val="13E33205"/>
     <w:multiLevelType w:val="hybridMultilevel"/>
     <w:tmpl w:val="6C92BB0E"/>
@@ -2845,7 +3022,7 @@
       </w:pPr>
     </w:lvl>
   </w:abstractNum>
-  <w:abstractNum w:abstractNumId="4" w15:restartNumberingAfterBreak="0">
+  <w:abstractNum w:abstractNumId="3" w15:restartNumberingAfterBreak="0">
     <w:nsid w:val="19D95D12"/>
     <w:multiLevelType w:val="hybridMultilevel"/>
     <w:tmpl w:val="827EA0CC"/>
@@ -2934,7 +3111,7 @@
       </w:pPr>
     </w:lvl>
   </w:abstractNum>
-  <w:abstractNum w:abstractNumId="5" w15:restartNumberingAfterBreak="0">
+  <w:abstractNum w:abstractNumId="4" w15:restartNumberingAfterBreak="0">
     <w:nsid w:val="1ABE28FD"/>
     <w:multiLevelType w:val="hybridMultilevel"/>
     <w:tmpl w:val="7CF2C476"/>
@@ -3023,7 +3200,7 @@
       </w:pPr>
     </w:lvl>
   </w:abstractNum>
-  <w:abstractNum w:abstractNumId="6" w15:restartNumberingAfterBreak="0">
+  <w:abstractNum w:abstractNumId="5" w15:restartNumberingAfterBreak="0">
     <w:nsid w:val="1E9578BF"/>
     <w:multiLevelType w:val="hybridMultilevel"/>
     <w:tmpl w:val="78D852CA"/>
@@ -3118,7 +3295,7 @@
       </w:pPr>
     </w:lvl>
   </w:abstractNum>
-  <w:abstractNum w:abstractNumId="7" w15:restartNumberingAfterBreak="0">
+  <w:abstractNum w:abstractNumId="6" w15:restartNumberingAfterBreak="0">
     <w:nsid w:val="244B13D1"/>
     <w:multiLevelType w:val="hybridMultilevel"/>
     <w:tmpl w:val="AC2EE11A"/>
@@ -3207,7 +3384,7 @@
       </w:pPr>
     </w:lvl>
   </w:abstractNum>
-  <w:abstractNum w:abstractNumId="8" w15:restartNumberingAfterBreak="0">
+  <w:abstractNum w:abstractNumId="7" w15:restartNumberingAfterBreak="0">
     <w:nsid w:val="2BCD1E9A"/>
     <w:multiLevelType w:val="hybridMultilevel"/>
     <w:tmpl w:val="2E9EC92C"/>
@@ -3299,7 +3476,7 @@
       </w:pPr>
     </w:lvl>
   </w:abstractNum>
-  <w:abstractNum w:abstractNumId="9" w15:restartNumberingAfterBreak="0">
+  <w:abstractNum w:abstractNumId="8" w15:restartNumberingAfterBreak="0">
     <w:nsid w:val="30724304"/>
     <w:multiLevelType w:val="hybridMultilevel"/>
     <w:tmpl w:val="414EA330"/>
@@ -3388,7 +3565,7 @@
       </w:pPr>
     </w:lvl>
   </w:abstractNum>
-  <w:abstractNum w:abstractNumId="10" w15:restartNumberingAfterBreak="0">
+  <w:abstractNum w:abstractNumId="9" w15:restartNumberingAfterBreak="0">
     <w:nsid w:val="32D024A7"/>
     <w:multiLevelType w:val="hybridMultilevel"/>
     <w:tmpl w:val="F5EA9E1C"/>
@@ -3477,7 +3654,7 @@
       </w:pPr>
     </w:lvl>
   </w:abstractNum>
-  <w:abstractNum w:abstractNumId="11" w15:restartNumberingAfterBreak="0">
+  <w:abstractNum w:abstractNumId="10" w15:restartNumberingAfterBreak="0">
     <w:nsid w:val="3D715125"/>
     <w:multiLevelType w:val="hybridMultilevel"/>
     <w:tmpl w:val="408A57B8"/>
@@ -3566,7 +3743,7 @@
       </w:pPr>
     </w:lvl>
   </w:abstractNum>
-  <w:abstractNum w:abstractNumId="12" w15:restartNumberingAfterBreak="0">
+  <w:abstractNum w:abstractNumId="11" w15:restartNumberingAfterBreak="0">
     <w:nsid w:val="3F682CD4"/>
     <w:multiLevelType w:val="hybridMultilevel"/>
     <w:tmpl w:val="EB0840BE"/>
@@ -3655,7 +3832,7 @@
       </w:pPr>
     </w:lvl>
   </w:abstractNum>
-  <w:abstractNum w:abstractNumId="13" w15:restartNumberingAfterBreak="0">
+  <w:abstractNum w:abstractNumId="12" w15:restartNumberingAfterBreak="0">
     <w:nsid w:val="41010473"/>
     <w:multiLevelType w:val="hybridMultilevel"/>
     <w:tmpl w:val="F5EA9E1C"/>
@@ -3744,7 +3921,7 @@
       </w:pPr>
     </w:lvl>
   </w:abstractNum>
-  <w:abstractNum w:abstractNumId="14" w15:restartNumberingAfterBreak="0">
+  <w:abstractNum w:abstractNumId="13" w15:restartNumberingAfterBreak="0">
     <w:nsid w:val="4BE2500B"/>
     <w:multiLevelType w:val="multilevel"/>
     <w:tmpl w:val="0409001D"/>
@@ -3830,7 +4007,7 @@
       </w:pPr>
     </w:lvl>
   </w:abstractNum>
-  <w:abstractNum w:abstractNumId="15" w15:restartNumberingAfterBreak="0">
+  <w:abstractNum w:abstractNumId="14" w15:restartNumberingAfterBreak="0">
     <w:nsid w:val="4DC37740"/>
     <w:multiLevelType w:val="hybridMultilevel"/>
     <w:tmpl w:val="6888BD9E"/>
@@ -3916,6 +4093,23 @@
       <w:lvlJc w:val="right"/>
       <w:pPr>
         <w:ind w:left="3780" w:hanging="420"/>
+      </w:pPr>
+    </w:lvl>
+  </w:abstractNum>
+  <w:abstractNum w:abstractNumId="15" w15:restartNumberingAfterBreak="0">
+    <w:nsid w:val="5659659B"/>
+    <w:multiLevelType w:val="singleLevel"/>
+    <w:tmpl w:val="50ECCD12"/>
+    <w:lvl w:ilvl="0">
+      <w:start w:val="1"/>
+      <w:numFmt w:val="bullet"/>
+      <w:lvlText w:val="•"/>
+      <w:lvlJc w:val="left"/>
+      <w:pPr>
+        <w:tabs>
+          <w:tab w:val="num" w:pos="420"/>
+        </w:tabs>
+        <w:ind w:left="720" w:hanging="300"/>
       </w:pPr>
     </w:lvl>
   </w:abstractNum>
@@ -4643,8 +4837,8 @@
       </w:pPr>
     </w:lvl>
   </w:abstractNum>
-  <w:num w:numId="1" w16cid:durableId="429349371">
-    <w:abstractNumId w:val="1"/>
+  <w:num w:numId="1" w16cid:durableId="1295864602">
+    <w:abstractNumId w:val="15"/>
   </w:num>
   <w:numIdMacAtCleanup w:val="15"/>
 </w:numbering>
@@ -5482,7 +5676,7 @@
     <w:qFormat/>
     <w:rsid w:val="008C7A00"/>
     <w:pPr>
-      <w:spacing w:after="20" w:line="240" w:lineRule="auto"/>
+      <w:spacing w:line="240" w:lineRule="auto"/>
       <w:ind w:firstLineChars="0" w:firstLine="0"/>
       <w:jc w:val="left"/>
     </w:pPr>
@@ -5503,7 +5697,7 @@
     <w:qFormat/>
     <w:rsid w:val="00AE65A3"/>
     <w:pPr>
-      <w:spacing w:after="20" w:line="240" w:lineRule="auto"/>
+      <w:spacing w:line="240" w:lineRule="auto"/>
       <w:ind w:leftChars="200" w:left="369" w:firstLineChars="0" w:firstLine="0"/>
     </w:pPr>
     <w:rPr>
@@ -5526,7 +5720,7 @@
       <w:tabs>
         <w:tab w:val="right" w:leader="dot" w:pos="8296"/>
       </w:tabs>
-      <w:spacing w:after="20" w:line="240" w:lineRule="auto"/>
+      <w:spacing w:line="240" w:lineRule="auto"/>
       <w:ind w:left="737" w:firstLineChars="0" w:firstLine="0"/>
       <w:jc w:val="right"/>
     </w:pPr>

</xml_diff>